<commit_message>
Halfway through trying to shorten field lengths in fact file
</commit_message>
<xml_diff>
--- a/CHANGE TRACKING/Progress Chase.docx
+++ b/CHANGE TRACKING/Progress Chase.docx
@@ -76,13 +76,8 @@
         </w:numPr>
       </w:pPr>
       <w:r>
-        <w:t xml:space="preserve">Rewrite ‘Calculate Pivoted Additions’ to work on the Fact table instead of </w:t>
+        <w:t>Rewrite ‘Calculate Pivoted Additions’ to work on the Fact table instead of Factsource</w:t>
       </w:r>
-      <w:proofErr w:type="spellStart"/>
-      <w:r>
-        <w:t>Factsource</w:t>
-      </w:r>
-      <w:proofErr w:type="spellEnd"/>
     </w:p>
     <w:p>
       <w:pPr>
@@ -248,19 +243,31 @@
           <w:tcPr>
             <w:tcW w:w="1271" w:type="dxa"/>
           </w:tcPr>
-          <w:p/>
+          <w:p>
+            <w:r>
+              <w:t>1</w:t>
+            </w:r>
+          </w:p>
         </w:tc>
         <w:tc>
           <w:tcPr>
             <w:tcW w:w="3260" w:type="dxa"/>
           </w:tcPr>
-          <w:p/>
+          <w:p>
+            <w:r>
+              <w:t>Unpivot directly done</w:t>
+            </w:r>
+          </w:p>
         </w:tc>
         <w:tc>
           <w:tcPr>
             <w:tcW w:w="4819" w:type="dxa"/>
           </w:tcPr>
-          <w:p/>
+          <w:p>
+            <w:r>
+              <w:t>Ran</w:t>
+            </w:r>
+          </w:p>
         </w:tc>
       </w:tr>
       <w:tr>
@@ -268,13 +275,21 @@
           <w:tcPr>
             <w:tcW w:w="1271" w:type="dxa"/>
           </w:tcPr>
-          <w:p/>
+          <w:p>
+            <w:r>
+              <w:t>1</w:t>
+            </w:r>
+          </w:p>
         </w:tc>
         <w:tc>
           <w:tcPr>
             <w:tcW w:w="3260" w:type="dxa"/>
           </w:tcPr>
-          <w:p/>
+          <w:p>
+            <w:r>
+              <w:t>Remove pivoted tables and test</w:t>
+            </w:r>
+          </w:p>
         </w:tc>
         <w:tc>
           <w:tcPr>
@@ -471,7 +486,6 @@
     <w:lvl w:ilvl="0">
       <w:start w:val="1"/>
       <w:numFmt w:val="decimal"/>
-      <w:pStyle w:val="Heading2"/>
       <w:lvlText w:val="%1."/>
       <w:lvlJc w:val="left"/>
       <w:pPr>

</xml_diff>

<commit_message>
ROLAP overhaul and validate
Checked and validated ROLAP export
</commit_message>
<xml_diff>
--- a/CHANGE TRACKING/Progress Chase.docx
+++ b/CHANGE TRACKING/Progress Chase.docx
@@ -31,20 +31,6 @@
     </w:p>
     <w:p>
       <w:pPr>
-        <w:pStyle w:val="Heading2"/>
-        <w:rPr>
-          <w:lang w:val="en-GB"/>
-        </w:rPr>
-      </w:pPr>
-      <w:r>
-        <w:rPr>
-          <w:lang w:val="en-GB"/>
-        </w:rPr>
-        <w:t>21 August Plans</w:t>
-      </w:r>
-    </w:p>
-    <w:p>
-      <w:pPr>
         <w:pStyle w:val="Heading3"/>
         <w:numPr>
           <w:ilvl w:val="0"/>
@@ -76,7 +62,56 @@
         </w:numPr>
       </w:pPr>
       <w:r>
-        <w:t>Rewrite ‘Calculate Pivoted Additions’ to work on the Fact table instead of Factsource</w:t>
+        <w:t xml:space="preserve">Rewrite ‘Calculate Pivoted Additions’ to work on the Fact table instead of </w:t>
+      </w:r>
+      <w:proofErr w:type="spellStart"/>
+      <w:r>
+        <w:t>Factsource</w:t>
+      </w:r>
+      <w:proofErr w:type="spellEnd"/>
+    </w:p>
+    <w:p>
+      <w:pPr>
+        <w:pStyle w:val="Heading3"/>
+        <w:numPr>
+          <w:ilvl w:val="0"/>
+          <w:numId w:val="4"/>
+        </w:numPr>
+      </w:pPr>
+      <w:r>
+        <w:t>Routine maintenance and debugging</w:t>
+      </w:r>
+    </w:p>
+    <w:p>
+      <w:pPr>
+        <w:pStyle w:val="ListParagraph"/>
+        <w:numPr>
+          <w:ilvl w:val="1"/>
+          <w:numId w:val="4"/>
+        </w:numPr>
+      </w:pPr>
+      <w:r>
+        <w:t xml:space="preserve">Create space on server to ensure project will run on </w:t>
+      </w:r>
+      <w:proofErr w:type="spellStart"/>
+      <w:r>
+        <w:t>MSSQLExpress</w:t>
+      </w:r>
+      <w:proofErr w:type="spellEnd"/>
+      <w:r>
+        <w:t xml:space="preserve"> (10GB per database)</w:t>
+      </w:r>
+    </w:p>
+    <w:p>
+      <w:pPr>
+        <w:pStyle w:val="ListParagraph"/>
+        <w:numPr>
+          <w:ilvl w:val="1"/>
+          <w:numId w:val="4"/>
+        </w:numPr>
+      </w:pPr>
+      <w:r>
+        <w:t>Overhaul and validate ROLAP export</w:t>
       </w:r>
     </w:p>
     <w:p>
@@ -202,14 +237,15 @@
         <w:tblLook w:val="04A0" w:firstRow="1" w:lastRow="0" w:firstColumn="1" w:lastColumn="0" w:noHBand="0" w:noVBand="1"/>
       </w:tblPr>
       <w:tblGrid>
-        <w:gridCol w:w="1271"/>
-        <w:gridCol w:w="3260"/>
-        <w:gridCol w:w="4819"/>
+        <w:gridCol w:w="1112"/>
+        <w:gridCol w:w="2253"/>
+        <w:gridCol w:w="2493"/>
+        <w:gridCol w:w="3492"/>
       </w:tblGrid>
       <w:tr>
         <w:tc>
           <w:tcPr>
-            <w:tcW w:w="1271" w:type="dxa"/>
+            <w:tcW w:w="1112" w:type="dxa"/>
           </w:tcPr>
           <w:p>
             <w:r>
@@ -219,7 +255,17 @@
         </w:tc>
         <w:tc>
           <w:tcPr>
-            <w:tcW w:w="3260" w:type="dxa"/>
+            <w:tcW w:w="2253" w:type="dxa"/>
+          </w:tcPr>
+          <w:p>
+            <w:r>
+              <w:t>Date</w:t>
+            </w:r>
+          </w:p>
+        </w:tc>
+        <w:tc>
+          <w:tcPr>
+            <w:tcW w:w="2493" w:type="dxa"/>
           </w:tcPr>
           <w:p>
             <w:r>
@@ -229,7 +275,7 @@
         </w:tc>
         <w:tc>
           <w:tcPr>
-            <w:tcW w:w="4819" w:type="dxa"/>
+            <w:tcW w:w="3492" w:type="dxa"/>
           </w:tcPr>
           <w:p>
             <w:r>
@@ -241,17 +287,27 @@
       <w:tr>
         <w:tc>
           <w:tcPr>
-            <w:tcW w:w="1271" w:type="dxa"/>
+            <w:tcW w:w="1112" w:type="dxa"/>
           </w:tcPr>
           <w:p>
             <w:r>
-              <w:t>1</w:t>
+              <w:t>1a</w:t>
             </w:r>
           </w:p>
         </w:tc>
         <w:tc>
           <w:tcPr>
-            <w:tcW w:w="3260" w:type="dxa"/>
+            <w:tcW w:w="2253" w:type="dxa"/>
+          </w:tcPr>
+          <w:p>
+            <w:r>
+              <w:t>21/8/20</w:t>
+            </w:r>
+          </w:p>
+        </w:tc>
+        <w:tc>
+          <w:tcPr>
+            <w:tcW w:w="2493" w:type="dxa"/>
           </w:tcPr>
           <w:p>
             <w:r>
@@ -261,11 +317,11 @@
         </w:tc>
         <w:tc>
           <w:tcPr>
-            <w:tcW w:w="4819" w:type="dxa"/>
+            <w:tcW w:w="3492" w:type="dxa"/>
           </w:tcPr>
           <w:p>
             <w:r>
-              <w:t>Ran</w:t>
+              <w:t>Ran, data not checked</w:t>
             </w:r>
           </w:p>
         </w:tc>
@@ -273,17 +329,27 @@
       <w:tr>
         <w:tc>
           <w:tcPr>
-            <w:tcW w:w="1271" w:type="dxa"/>
+            <w:tcW w:w="1112" w:type="dxa"/>
           </w:tcPr>
           <w:p>
             <w:r>
-              <w:t>1</w:t>
+              <w:t>1b</w:t>
             </w:r>
           </w:p>
         </w:tc>
         <w:tc>
           <w:tcPr>
-            <w:tcW w:w="3260" w:type="dxa"/>
+            <w:tcW w:w="2253" w:type="dxa"/>
+          </w:tcPr>
+          <w:p>
+            <w:r>
+              <w:t>21/8/20</w:t>
+            </w:r>
+          </w:p>
+        </w:tc>
+        <w:tc>
+          <w:tcPr>
+            <w:tcW w:w="2493" w:type="dxa"/>
           </w:tcPr>
           <w:p>
             <w:r>
@@ -293,47 +359,84 @@
         </w:tc>
         <w:tc>
           <w:tcPr>
-            <w:tcW w:w="4819" w:type="dxa"/>
-          </w:tcPr>
-          <w:p/>
+            <w:tcW w:w="3492" w:type="dxa"/>
+          </w:tcPr>
+          <w:p>
+            <w:r>
+              <w:t>Ran, data not checked</w:t>
+            </w:r>
+          </w:p>
         </w:tc>
       </w:tr>
       <w:tr>
         <w:tc>
           <w:tcPr>
-            <w:tcW w:w="1271" w:type="dxa"/>
-          </w:tcPr>
-          <w:p/>
-        </w:tc>
-        <w:tc>
-          <w:tcPr>
-            <w:tcW w:w="3260" w:type="dxa"/>
-          </w:tcPr>
-          <w:p/>
-        </w:tc>
-        <w:tc>
-          <w:tcPr>
-            <w:tcW w:w="4819" w:type="dxa"/>
-          </w:tcPr>
-          <w:p/>
+            <w:tcW w:w="1112" w:type="dxa"/>
+          </w:tcPr>
+          <w:p>
+            <w:r>
+              <w:t>2a</w:t>
+            </w:r>
+          </w:p>
+        </w:tc>
+        <w:tc>
+          <w:tcPr>
+            <w:tcW w:w="2253" w:type="dxa"/>
+          </w:tcPr>
+          <w:p>
+            <w:r>
+              <w:t>22/8/20</w:t>
+            </w:r>
+          </w:p>
+        </w:tc>
+        <w:tc>
+          <w:tcPr>
+            <w:tcW w:w="2493" w:type="dxa"/>
+          </w:tcPr>
+          <w:p>
+            <w:r>
+              <w:t xml:space="preserve">Achieved by removing the extra index on </w:t>
+            </w:r>
+            <w:proofErr w:type="spellStart"/>
+            <w:r>
+              <w:t>FactSource</w:t>
+            </w:r>
+            <w:proofErr w:type="spellEnd"/>
+          </w:p>
+        </w:tc>
+        <w:tc>
+          <w:tcPr>
+            <w:tcW w:w="3492" w:type="dxa"/>
+          </w:tcPr>
+          <w:p>
+            <w:r>
+              <w:t>Ran, data not checked</w:t>
+            </w:r>
+          </w:p>
         </w:tc>
       </w:tr>
       <w:tr>
         <w:tc>
           <w:tcPr>
-            <w:tcW w:w="1271" w:type="dxa"/>
+            <w:tcW w:w="1112" w:type="dxa"/>
           </w:tcPr>
           <w:p/>
         </w:tc>
         <w:tc>
           <w:tcPr>
-            <w:tcW w:w="3260" w:type="dxa"/>
+            <w:tcW w:w="2253" w:type="dxa"/>
           </w:tcPr>
           <w:p/>
         </w:tc>
         <w:tc>
           <w:tcPr>
-            <w:tcW w:w="4819" w:type="dxa"/>
+            <w:tcW w:w="2493" w:type="dxa"/>
+          </w:tcPr>
+          <w:p/>
+        </w:tc>
+        <w:tc>
+          <w:tcPr>
+            <w:tcW w:w="3492" w:type="dxa"/>
           </w:tcPr>
           <w:p/>
         </w:tc>
@@ -341,19 +444,25 @@
       <w:tr>
         <w:tc>
           <w:tcPr>
-            <w:tcW w:w="1271" w:type="dxa"/>
+            <w:tcW w:w="1112" w:type="dxa"/>
           </w:tcPr>
           <w:p/>
         </w:tc>
         <w:tc>
           <w:tcPr>
-            <w:tcW w:w="3260" w:type="dxa"/>
+            <w:tcW w:w="2253" w:type="dxa"/>
           </w:tcPr>
           <w:p/>
         </w:tc>
         <w:tc>
           <w:tcPr>
-            <w:tcW w:w="4819" w:type="dxa"/>
+            <w:tcW w:w="2493" w:type="dxa"/>
+          </w:tcPr>
+          <w:p/>
+        </w:tc>
+        <w:tc>
+          <w:tcPr>
+            <w:tcW w:w="3492" w:type="dxa"/>
           </w:tcPr>
           <w:p/>
         </w:tc>
@@ -361,19 +470,25 @@
       <w:tr>
         <w:tc>
           <w:tcPr>
-            <w:tcW w:w="1271" w:type="dxa"/>
+            <w:tcW w:w="1112" w:type="dxa"/>
           </w:tcPr>
           <w:p/>
         </w:tc>
         <w:tc>
           <w:tcPr>
-            <w:tcW w:w="3260" w:type="dxa"/>
+            <w:tcW w:w="2253" w:type="dxa"/>
           </w:tcPr>
           <w:p/>
         </w:tc>
         <w:tc>
           <w:tcPr>
-            <w:tcW w:w="4819" w:type="dxa"/>
+            <w:tcW w:w="2493" w:type="dxa"/>
+          </w:tcPr>
+          <w:p/>
+        </w:tc>
+        <w:tc>
+          <w:tcPr>
+            <w:tcW w:w="3492" w:type="dxa"/>
           </w:tcPr>
           <w:p/>
         </w:tc>
@@ -381,19 +496,25 @@
       <w:tr>
         <w:tc>
           <w:tcPr>
-            <w:tcW w:w="1271" w:type="dxa"/>
+            <w:tcW w:w="1112" w:type="dxa"/>
           </w:tcPr>
           <w:p/>
         </w:tc>
         <w:tc>
           <w:tcPr>
-            <w:tcW w:w="3260" w:type="dxa"/>
+            <w:tcW w:w="2253" w:type="dxa"/>
           </w:tcPr>
           <w:p/>
         </w:tc>
         <w:tc>
           <w:tcPr>
-            <w:tcW w:w="4819" w:type="dxa"/>
+            <w:tcW w:w="2493" w:type="dxa"/>
+          </w:tcPr>
+          <w:p/>
+        </w:tc>
+        <w:tc>
+          <w:tcPr>
+            <w:tcW w:w="3492" w:type="dxa"/>
           </w:tcPr>
           <w:p>
             <w:pPr>
@@ -407,19 +528,25 @@
       <w:tr>
         <w:tc>
           <w:tcPr>
-            <w:tcW w:w="1271" w:type="dxa"/>
+            <w:tcW w:w="1112" w:type="dxa"/>
           </w:tcPr>
           <w:p/>
         </w:tc>
         <w:tc>
           <w:tcPr>
-            <w:tcW w:w="3260" w:type="dxa"/>
+            <w:tcW w:w="2253" w:type="dxa"/>
           </w:tcPr>
           <w:p/>
         </w:tc>
         <w:tc>
           <w:tcPr>
-            <w:tcW w:w="4819" w:type="dxa"/>
+            <w:tcW w:w="2493" w:type="dxa"/>
+          </w:tcPr>
+          <w:p/>
+        </w:tc>
+        <w:tc>
+          <w:tcPr>
+            <w:tcW w:w="3492" w:type="dxa"/>
           </w:tcPr>
           <w:p>
             <w:pPr>
@@ -433,19 +560,25 @@
       <w:tr>
         <w:tc>
           <w:tcPr>
-            <w:tcW w:w="1271" w:type="dxa"/>
+            <w:tcW w:w="1112" w:type="dxa"/>
           </w:tcPr>
           <w:p/>
         </w:tc>
         <w:tc>
           <w:tcPr>
-            <w:tcW w:w="3260" w:type="dxa"/>
+            <w:tcW w:w="2253" w:type="dxa"/>
           </w:tcPr>
           <w:p/>
         </w:tc>
         <w:tc>
           <w:tcPr>
-            <w:tcW w:w="4819" w:type="dxa"/>
+            <w:tcW w:w="2493" w:type="dxa"/>
+          </w:tcPr>
+          <w:p/>
+        </w:tc>
+        <w:tc>
+          <w:tcPr>
+            <w:tcW w:w="3492" w:type="dxa"/>
           </w:tcPr>
           <w:p>
             <w:pPr>

</xml_diff>